<commit_message>
Release 1.3: require confirmed content and source template selection
</commit_message>
<xml_diff>
--- a/assets/catalog/T02.docx
+++ b/assets/catalog/T02.docx
@@ -7,6 +7,7 @@
       <w:pPr>
         <w:adjustRightInd w:val="0"/>
         <w:snapToGrid w:val="0"/>
+        <w:spacing w:line="20" w:lineRule="exact" w:before="0" w:after="0"/>
       </w:pPr>
       <w:r>
         <mc:AlternateContent>
@@ -17,8 +18,8 @@
                 <wp:positionH relativeFrom="column">
                   <wp:posOffset>-8255</wp:posOffset>
                 </wp:positionH>
-                <wp:positionV relativeFrom="paragraph">
-                  <wp:posOffset>2540</wp:posOffset>
+                <wp:positionV relativeFrom="page">
+                  <wp:posOffset>0</wp:posOffset>
                 </wp:positionV>
                 <wp:extent cx="7578725" cy="10683240"/>
                 <wp:effectExtent l="7620" t="7620" r="14605" b="15240"/>
@@ -59,7 +60,7 @@
           </mc:Choice>
           <mc:Fallback>
             <w:pict>
-              <v:rect id="矩形 534" o:spid="_x0000_s1026" o:spt="1" style="position:absolute;left:0pt;margin-left:-0.65pt;margin-top:0.2pt;height:841.2pt;width:596.75pt;z-index:-251658240;mso-width-relative:page;mso-height-relative:page;" fillcolor="#2E74B5" filled="t" stroked="t" coordsize="21600,21600" o:gfxdata="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">
+              <v:rect id="矩形 534" o:spid="_x0000_s1026" o:spt="1" style="position:absolute;left:0pt;margin-left:-0.65pt;margin-top:0pt;height:841.2pt;width:596.75pt;z-index:-251658240;mso-width-relative:page;mso-height-relative:page;" fillcolor="#2E74B5" filled="t" stroked="t" coordsize="21600,21600" o:gfxdata="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">
                 <v:fill on="t" focussize="0,0"/>
                 <v:stroke weight="1.25pt" color="#739CC3" joinstyle="miter"/>
                 <v:imagedata o:title=""/>
@@ -78,8 +79,8 @@
                 <wp:positionH relativeFrom="column">
                   <wp:posOffset>93345</wp:posOffset>
                 </wp:positionH>
-                <wp:positionV relativeFrom="paragraph">
-                  <wp:posOffset>81915</wp:posOffset>
+                <wp:positionV relativeFrom="page">
+                  <wp:posOffset>63500</wp:posOffset>
                 </wp:positionV>
                 <wp:extent cx="7329170" cy="10467975"/>
                 <wp:effectExtent l="8255" t="7620" r="15875" b="20955"/>
@@ -120,7 +121,7 @@
           </mc:Choice>
           <mc:Fallback>
             <w:pict>
-              <v:rect id="矩形 535" o:spid="_x0000_s1026" o:spt="1" style="position:absolute;left:0pt;margin-left:7.35pt;margin-top:6.45pt;height:824.25pt;width:577.1pt;z-index:-251657216;mso-width-relative:page;mso-height-relative:page;" fillcolor="#F2F2F2" filled="t" stroked="t" coordsize="21600,21600" o:gfxdata="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">
+              <v:rect id="矩形 535" o:spid="_x0000_s1026" o:spt="1" style="position:absolute;left:0pt;margin-left:7.35pt;margin-top:5pt;height:824.25pt;width:577.1pt;z-index:-251657216;mso-width-relative:page;mso-height-relative:page;" fillcolor="#F2F2F2" filled="t" stroked="t" coordsize="21600,21600" o:gfxdata="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">
                 <v:fill on="t" focussize="0,0"/>
                 <v:stroke weight="1.25pt" color="#739CC3" joinstyle="miter"/>
                 <v:imagedata o:title=""/>
@@ -130,24 +131,6 @@
           </mc:Fallback>
         </mc:AlternateContent>
       </w:r>
-    </w:p>
-    <w:p>
-      <w:pPr>
-        <w:adjustRightInd w:val="0"/>
-        <w:snapToGrid w:val="0"/>
-      </w:pPr>
-    </w:p>
-    <w:p>
-      <w:pPr>
-        <w:adjustRightInd w:val="0"/>
-        <w:snapToGrid w:val="0"/>
-      </w:pPr>
-    </w:p>
-    <w:p>
-      <w:pPr>
-        <w:adjustRightInd w:val="0"/>
-        <w:snapToGrid w:val="0"/>
-      </w:pPr>
       <w:r>
         <mc:AlternateContent>
           <mc:Choice Requires="wpg">
@@ -157,8 +140,8 @@
                 <wp:positionH relativeFrom="column">
                   <wp:posOffset>2670810</wp:posOffset>
                 </wp:positionH>
-                <wp:positionV relativeFrom="paragraph">
-                  <wp:posOffset>22860</wp:posOffset>
+                <wp:positionV relativeFrom="page">
+                  <wp:posOffset>368300</wp:posOffset>
                 </wp:positionV>
                 <wp:extent cx="4453255" cy="283845"/>
                 <wp:effectExtent l="19050" t="4445" r="4445" b="16510"/>
@@ -452,12 +435,6 @@
           </mc:Fallback>
         </mc:AlternateContent>
       </w:r>
-    </w:p>
-    <w:p>
-      <w:pPr>
-        <w:adjustRightInd w:val="0"/>
-        <w:snapToGrid w:val="0"/>
-      </w:pPr>
       <w:r>
         <w:drawing>
           <wp:anchor distT="0" distB="0" distL="114300" distR="114300" simplePos="0" relativeHeight="251675648" behindDoc="0" locked="0" layoutInCell="1" allowOverlap="1">
@@ -465,8 +442,8 @@
             <wp:positionH relativeFrom="column">
               <wp:posOffset>842645</wp:posOffset>
             </wp:positionH>
-            <wp:positionV relativeFrom="paragraph">
-              <wp:posOffset>55245</wp:posOffset>
+            <wp:positionV relativeFrom="page">
+              <wp:posOffset>787400</wp:posOffset>
             </wp:positionV>
             <wp:extent cx="1009650" cy="1442085"/>
             <wp:effectExtent l="19050" t="19050" r="19050" b="24765"/>
@@ -531,8 +508,8 @@
                 <wp:positionH relativeFrom="column">
                   <wp:posOffset>2479040</wp:posOffset>
                 </wp:positionH>
-                <wp:positionV relativeFrom="paragraph">
-                  <wp:posOffset>153035</wp:posOffset>
+                <wp:positionV relativeFrom="page">
+                  <wp:posOffset>762000</wp:posOffset>
                 </wp:positionV>
                 <wp:extent cx="4852670" cy="1106170"/>
                 <wp:effectExtent l="0" t="0" r="0" b="0"/>
@@ -671,7 +648,7 @@
           </mc:Choice>
           <mc:Fallback>
             <w:pict>
-              <v:shape id="文本框 88" o:spid="_x0000_s1026" o:spt="202" type="#_x0000_t202" style="position:absolute;left:0pt;margin-left:195.2pt;margin-top:12.05pt;height:87.1pt;width:382.1pt;z-index:251663360;mso-width-relative:page;mso-height-relative:page;" filled="f" stroked="f" coordsize="21600,21600" o:gfxdata="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">
+              <v:shape id="文本框 88" o:spid="_x0000_s1026" o:spt="202" type="#_x0000_t202" style="position:absolute;left:0pt;margin-left:195.2pt;margin-top:60pt;height:87.1pt;width:382.1pt;z-index:251663360;mso-width-relative:page;mso-height-relative:page;" filled="f" stroked="f" coordsize="21600,21600" o:gfxdata="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">
                 <v:fill on="f" focussize="0,0"/>
                 <v:stroke on="f"/>
                 <v:imagedata o:title=""/>
@@ -787,62 +764,8 @@
           </mc:Fallback>
         </mc:AlternateContent>
       </w:r>
-    </w:p>
-    <w:p>
-      <w:pPr>
-        <w:adjustRightInd w:val="0"/>
-        <w:snapToGrid w:val="0"/>
-      </w:pPr>
-    </w:p>
-    <w:p>
-      <w:pPr>
-        <w:adjustRightInd w:val="0"/>
-        <w:snapToGrid w:val="0"/>
-      </w:pPr>
-    </w:p>
-    <w:p>
-      <w:pPr>
-        <w:adjustRightInd w:val="0"/>
-        <w:snapToGrid w:val="0"/>
-      </w:pPr>
-    </w:p>
-    <w:p>
-      <w:pPr>
-        <w:adjustRightInd w:val="0"/>
-        <w:snapToGrid w:val="0"/>
-      </w:pPr>
       <w:bookmarkStart w:id="0" w:name="_GoBack"/>
       <w:bookmarkEnd w:id="0"/>
-    </w:p>
-    <w:p>
-      <w:pPr>
-        <w:adjustRightInd w:val="0"/>
-        <w:snapToGrid w:val="0"/>
-      </w:pPr>
-    </w:p>
-    <w:p>
-      <w:pPr>
-        <w:adjustRightInd w:val="0"/>
-        <w:snapToGrid w:val="0"/>
-      </w:pPr>
-    </w:p>
-    <w:p>
-      <w:pPr>
-        <w:adjustRightInd w:val="0"/>
-        <w:snapToGrid w:val="0"/>
-      </w:pPr>
-    </w:p>
-    <w:p>
-      <w:pPr>
-        <w:adjustRightInd w:val="0"/>
-        <w:snapToGrid w:val="0"/>
-      </w:pPr>
-    </w:p>
-    <w:p>
-      <w:pPr>
-        <w:adjustRightInd w:val="0"/>
-        <w:snapToGrid w:val="0"/>
-      </w:pPr>
       <w:r>
         <mc:AlternateContent>
           <mc:Choice Requires="wpg">
@@ -852,8 +775,8 @@
                 <wp:positionH relativeFrom="margin">
                   <wp:posOffset>2668270</wp:posOffset>
                 </wp:positionH>
-                <wp:positionV relativeFrom="paragraph">
-                  <wp:posOffset>108585</wp:posOffset>
+                <wp:positionV relativeFrom="page">
+                  <wp:posOffset>2349500</wp:posOffset>
                 </wp:positionV>
                 <wp:extent cx="4453255" cy="283845"/>
                 <wp:effectExtent l="19050" t="4445" r="4445" b="16510"/>
@@ -1147,18 +1070,6 @@
           </mc:Fallback>
         </mc:AlternateContent>
       </w:r>
-    </w:p>
-    <w:p>
-      <w:pPr>
-        <w:adjustRightInd w:val="0"/>
-        <w:snapToGrid w:val="0"/>
-      </w:pPr>
-    </w:p>
-    <w:p>
-      <w:pPr>
-        <w:adjustRightInd w:val="0"/>
-        <w:snapToGrid w:val="0"/>
-      </w:pPr>
       <w:r>
         <mc:AlternateContent>
           <mc:Choice Requires="wps">
@@ -1168,8 +1079,8 @@
                 <wp:positionH relativeFrom="column">
                   <wp:posOffset>2500630</wp:posOffset>
                 </wp:positionH>
-                <wp:positionV relativeFrom="paragraph">
-                  <wp:posOffset>85725</wp:posOffset>
+                <wp:positionV relativeFrom="page">
+                  <wp:posOffset>2692400</wp:posOffset>
                 </wp:positionV>
                 <wp:extent cx="4636135" cy="4350385"/>
                 <wp:effectExtent l="0" t="0" r="0" b="0"/>
@@ -1200,7 +1111,7 @@
                               <w:pStyle w:val="5"/>
                               <w:adjustRightInd w:val="0"/>
                               <w:snapToGrid w:val="0"/>
-                              <w:spacing w:before="0" w:beforeAutospacing="0" w:after="0" w:afterAutospacing="0" w:line="360" w:lineRule="auto"/>
+                              <w:spacing w:before="0" w:beforeAutospacing="0" w:after="0" w:afterAutospacing="0" w:line="280" w:lineRule="exact"/>
                               <w:ind w:firstLine="403"/>
                               <w:rPr>
                                 <w:rFonts w:ascii="微软雅黑" w:hAnsi="微软雅黑" w:eastAsia="微软雅黑"/>
@@ -1280,7 +1191,7 @@
                               </w:numPr>
                               <w:adjustRightInd w:val="0"/>
                               <w:snapToGrid w:val="0"/>
-                              <w:spacing w:before="0" w:beforeAutospacing="0" w:after="0" w:afterAutospacing="0" w:line="360" w:lineRule="auto"/>
+                              <w:spacing w:before="0" w:beforeAutospacing="0" w:after="0" w:afterAutospacing="0" w:line="280" w:lineRule="exact"/>
                               <w:rPr>
                                 <w:rFonts w:ascii="微软雅黑" w:hAnsi="微软雅黑" w:eastAsia="微软雅黑"/>
                                 <w:b/>
@@ -1362,7 +1273,7 @@
                               </w:numPr>
                               <w:adjustRightInd w:val="0"/>
                               <w:snapToGrid w:val="0"/>
-                              <w:spacing w:before="0" w:beforeAutospacing="0" w:after="0" w:afterAutospacing="0" w:line="360" w:lineRule="auto"/>
+                              <w:spacing w:before="0" w:beforeAutospacing="0" w:after="0" w:afterAutospacing="0" w:line="280" w:lineRule="exact"/>
                               <w:rPr>
                                 <w:rFonts w:ascii="微软雅黑" w:hAnsi="微软雅黑" w:eastAsia="微软雅黑"/>
                                 <w:b/>
@@ -1408,7 +1319,7 @@
                               </w:numPr>
                               <w:adjustRightInd w:val="0"/>
                               <w:snapToGrid w:val="0"/>
-                              <w:spacing w:before="0" w:beforeAutospacing="0" w:after="0" w:afterAutospacing="0" w:line="360" w:lineRule="auto"/>
+                              <w:spacing w:before="0" w:beforeAutospacing="0" w:after="0" w:afterAutospacing="0" w:line="280" w:lineRule="exact"/>
                               <w:rPr>
                                 <w:rFonts w:ascii="微软雅黑" w:hAnsi="微软雅黑" w:eastAsia="微软雅黑"/>
                                 <w:b/>
@@ -1432,7 +1343,7 @@
                               <w:pStyle w:val="5"/>
                               <w:adjustRightInd w:val="0"/>
                               <w:snapToGrid w:val="0"/>
-                              <w:spacing w:before="0" w:beforeAutospacing="0" w:after="0" w:afterAutospacing="0" w:line="360" w:lineRule="auto"/>
+                              <w:spacing w:before="0" w:beforeAutospacing="0" w:after="0" w:afterAutospacing="0" w:line="280" w:lineRule="exact"/>
                               <w:ind w:left="403"/>
                               <w:rPr>
                                 <w:rFonts w:ascii="微软雅黑" w:hAnsi="微软雅黑" w:eastAsia="微软雅黑"/>
@@ -1532,7 +1443,7 @@
                               </w:numPr>
                               <w:adjustRightInd w:val="0"/>
                               <w:snapToGrid w:val="0"/>
-                              <w:spacing w:before="0" w:beforeAutospacing="0" w:after="0" w:afterAutospacing="0" w:line="360" w:lineRule="auto"/>
+                              <w:spacing w:before="0" w:beforeAutospacing="0" w:after="0" w:afterAutospacing="0" w:line="280" w:lineRule="exact"/>
                               <w:rPr>
                                 <w:rFonts w:ascii="微软雅黑" w:hAnsi="微软雅黑" w:eastAsia="微软雅黑"/>
                                 <w:b/>
@@ -1578,7 +1489,7 @@
                               </w:numPr>
                               <w:adjustRightInd w:val="0"/>
                               <w:snapToGrid w:val="0"/>
-                              <w:spacing w:before="0" w:beforeAutospacing="0" w:after="0" w:afterAutospacing="0" w:line="360" w:lineRule="auto"/>
+                              <w:spacing w:before="0" w:beforeAutospacing="0" w:after="0" w:afterAutospacing="0" w:line="280" w:lineRule="exact"/>
                               <w:rPr>
                                 <w:rFonts w:ascii="微软雅黑" w:hAnsi="微软雅黑" w:eastAsia="微软雅黑"/>
                                 <w:b/>
@@ -1606,7 +1517,7 @@
                               </w:numPr>
                               <w:adjustRightInd w:val="0"/>
                               <w:snapToGrid w:val="0"/>
-                              <w:spacing w:before="0" w:beforeAutospacing="0" w:after="0" w:afterAutospacing="0" w:line="360" w:lineRule="auto"/>
+                              <w:spacing w:before="0" w:beforeAutospacing="0" w:after="0" w:afterAutospacing="0" w:line="280" w:lineRule="exact"/>
                               <w:rPr>
                                 <w:rFonts w:ascii="微软雅黑" w:hAnsi="微软雅黑" w:eastAsia="微软雅黑"/>
                                 <w:b/>
@@ -1690,7 +1601,7 @@
           </mc:Choice>
           <mc:Fallback>
             <w:pict>
-              <v:rect id="矩形 25" o:spid="_x0000_s1026" o:spt="1" style="position:absolute;left:0pt;margin-left:196.9pt;margin-top:6.75pt;height:342.55pt;width:365.05pt;z-index:251662336;mso-width-relative:page;mso-height-relative:page;" filled="f" stroked="f" coordsize="21600,21600" o:gfxdata="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">
+              <v:rect id="矩形 25" o:spid="_x0000_s1026" o:spt="1" style="position:absolute;left:0pt;margin-left:196.9pt;margin-top:212pt;height:342.55pt;width:365.05pt;z-index:251662336;mso-width-relative:page;mso-height-relative:page;" filled="f" stroked="f" coordsize="21600,21600" o:gfxdata="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">
                 <v:fill on="f" focussize="0,0"/>
                 <v:stroke on="f"/>
                 <v:imagedata o:title=""/>
@@ -1702,7 +1613,7 @@
                         <w:pStyle w:val="5"/>
                         <w:adjustRightInd w:val="0"/>
                         <w:snapToGrid w:val="0"/>
-                        <w:spacing w:before="0" w:beforeAutospacing="0" w:after="0" w:afterAutospacing="0" w:line="360" w:lineRule="auto"/>
+                        <w:spacing w:before="0" w:beforeAutospacing="0" w:after="0" w:afterAutospacing="0" w:line="280" w:lineRule="exact"/>
                         <w:ind w:firstLine="403"/>
                         <w:rPr>
                           <w:rFonts w:ascii="微软雅黑" w:hAnsi="微软雅黑" w:eastAsia="微软雅黑"/>
@@ -1782,7 +1693,7 @@
                         </w:numPr>
                         <w:adjustRightInd w:val="0"/>
                         <w:snapToGrid w:val="0"/>
-                        <w:spacing w:before="0" w:beforeAutospacing="0" w:after="0" w:afterAutospacing="0" w:line="360" w:lineRule="auto"/>
+                        <w:spacing w:before="0" w:beforeAutospacing="0" w:after="0" w:afterAutospacing="0" w:line="280" w:lineRule="exact"/>
                         <w:rPr>
                           <w:rFonts w:ascii="微软雅黑" w:hAnsi="微软雅黑" w:eastAsia="微软雅黑"/>
                           <w:b/>
@@ -1864,7 +1775,7 @@
                         </w:numPr>
                         <w:adjustRightInd w:val="0"/>
                         <w:snapToGrid w:val="0"/>
-                        <w:spacing w:before="0" w:beforeAutospacing="0" w:after="0" w:afterAutospacing="0" w:line="360" w:lineRule="auto"/>
+                        <w:spacing w:before="0" w:beforeAutospacing="0" w:after="0" w:afterAutospacing="0" w:line="280" w:lineRule="exact"/>
                         <w:rPr>
                           <w:rFonts w:ascii="微软雅黑" w:hAnsi="微软雅黑" w:eastAsia="微软雅黑"/>
                           <w:b/>
@@ -1910,7 +1821,7 @@
                         </w:numPr>
                         <w:adjustRightInd w:val="0"/>
                         <w:snapToGrid w:val="0"/>
-                        <w:spacing w:before="0" w:beforeAutospacing="0" w:after="0" w:afterAutospacing="0" w:line="360" w:lineRule="auto"/>
+                        <w:spacing w:before="0" w:beforeAutospacing="0" w:after="0" w:afterAutospacing="0" w:line="280" w:lineRule="exact"/>
                         <w:rPr>
                           <w:rFonts w:ascii="微软雅黑" w:hAnsi="微软雅黑" w:eastAsia="微软雅黑"/>
                           <w:b/>
@@ -1934,7 +1845,7 @@
                         <w:pStyle w:val="5"/>
                         <w:adjustRightInd w:val="0"/>
                         <w:snapToGrid w:val="0"/>
-                        <w:spacing w:before="0" w:beforeAutospacing="0" w:after="0" w:afterAutospacing="0" w:line="360" w:lineRule="auto"/>
+                        <w:spacing w:before="0" w:beforeAutospacing="0" w:after="0" w:afterAutospacing="0" w:line="280" w:lineRule="exact"/>
                         <w:ind w:left="403"/>
                         <w:rPr>
                           <w:rFonts w:ascii="微软雅黑" w:hAnsi="微软雅黑" w:eastAsia="微软雅黑"/>
@@ -2034,7 +1945,7 @@
                         </w:numPr>
                         <w:adjustRightInd w:val="0"/>
                         <w:snapToGrid w:val="0"/>
-                        <w:spacing w:before="0" w:beforeAutospacing="0" w:after="0" w:afterAutospacing="0" w:line="360" w:lineRule="auto"/>
+                        <w:spacing w:before="0" w:beforeAutospacing="0" w:after="0" w:afterAutospacing="0" w:line="280" w:lineRule="exact"/>
                         <w:rPr>
                           <w:rFonts w:ascii="微软雅黑" w:hAnsi="微软雅黑" w:eastAsia="微软雅黑"/>
                           <w:b/>
@@ -2080,7 +1991,7 @@
                         </w:numPr>
                         <w:adjustRightInd w:val="0"/>
                         <w:snapToGrid w:val="0"/>
-                        <w:spacing w:before="0" w:beforeAutospacing="0" w:after="0" w:afterAutospacing="0" w:line="360" w:lineRule="auto"/>
+                        <w:spacing w:before="0" w:beforeAutospacing="0" w:after="0" w:afterAutospacing="0" w:line="280" w:lineRule="exact"/>
                         <w:rPr>
                           <w:rFonts w:ascii="微软雅黑" w:hAnsi="微软雅黑" w:eastAsia="微软雅黑"/>
                           <w:b/>
@@ -2108,7 +2019,7 @@
                         </w:numPr>
                         <w:adjustRightInd w:val="0"/>
                         <w:snapToGrid w:val="0"/>
-                        <w:spacing w:before="0" w:beforeAutospacing="0" w:after="0" w:afterAutospacing="0" w:line="360" w:lineRule="auto"/>
+                        <w:spacing w:before="0" w:beforeAutospacing="0" w:after="0" w:afterAutospacing="0" w:line="280" w:lineRule="exact"/>
                         <w:rPr>
                           <w:rFonts w:ascii="微软雅黑" w:hAnsi="微软雅黑" w:eastAsia="微软雅黑"/>
                           <w:b/>
@@ -2188,12 +2099,6 @@
           </mc:Fallback>
         </mc:AlternateContent>
       </w:r>
-    </w:p>
-    <w:p>
-      <w:pPr>
-        <w:adjustRightInd w:val="0"/>
-        <w:snapToGrid w:val="0"/>
-      </w:pPr>
       <w:r>
         <mc:AlternateContent>
           <mc:Choice Requires="wps">
@@ -2203,8 +2108,8 @@
                 <wp:positionH relativeFrom="column">
                   <wp:posOffset>568960</wp:posOffset>
                 </wp:positionH>
-                <wp:positionV relativeFrom="paragraph">
-                  <wp:posOffset>18415</wp:posOffset>
+                <wp:positionV relativeFrom="page">
+                  <wp:posOffset>2984500</wp:posOffset>
                 </wp:positionV>
                 <wp:extent cx="1516380" cy="889635"/>
                 <wp:effectExtent l="0" t="0" r="0" b="0"/>
@@ -2330,7 +2235,7 @@
           </mc:Choice>
           <mc:Fallback>
             <w:pict>
-              <v:shape id="文本框 9" o:spid="_x0000_s1026" o:spt="202" type="#_x0000_t202" style="position:absolute;left:0pt;margin-left:44.8pt;margin-top:1.45pt;height:70.05pt;width:119.4pt;z-index:251660288;mso-width-relative:page;mso-height-relative:page;" filled="f" stroked="f" coordsize="21600,21600" o:gfxdata="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">
+              <v:shape id="文本框 9" o:spid="_x0000_s1026" o:spt="202" type="#_x0000_t202" style="position:absolute;left:0pt;margin-left:44.8pt;margin-top:235pt;height:70.05pt;width:119.4pt;z-index:251660288;mso-width-relative:page;mso-height-relative:page;" filled="f" stroked="f" coordsize="21600,21600" o:gfxdata="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">
                 <v:fill on="f" focussize="0,0"/>
                 <v:stroke on="f"/>
                 <v:imagedata o:title=""/>
@@ -2433,48 +2338,6 @@
           </mc:Fallback>
         </mc:AlternateContent>
       </w:r>
-    </w:p>
-    <w:p>
-      <w:pPr>
-        <w:adjustRightInd w:val="0"/>
-        <w:snapToGrid w:val="0"/>
-      </w:pPr>
-    </w:p>
-    <w:p>
-      <w:pPr>
-        <w:adjustRightInd w:val="0"/>
-        <w:snapToGrid w:val="0"/>
-      </w:pPr>
-    </w:p>
-    <w:p>
-      <w:pPr>
-        <w:adjustRightInd w:val="0"/>
-        <w:snapToGrid w:val="0"/>
-      </w:pPr>
-    </w:p>
-    <w:p>
-      <w:pPr>
-        <w:adjustRightInd w:val="0"/>
-        <w:snapToGrid w:val="0"/>
-      </w:pPr>
-    </w:p>
-    <w:p>
-      <w:pPr>
-        <w:adjustRightInd w:val="0"/>
-        <w:snapToGrid w:val="0"/>
-      </w:pPr>
-    </w:p>
-    <w:p>
-      <w:pPr>
-        <w:adjustRightInd w:val="0"/>
-        <w:snapToGrid w:val="0"/>
-      </w:pPr>
-    </w:p>
-    <w:p>
-      <w:pPr>
-        <w:adjustRightInd w:val="0"/>
-        <w:snapToGrid w:val="0"/>
-      </w:pPr>
       <w:r>
         <mc:AlternateContent>
           <mc:Choice Requires="wpg">
@@ -2484,8 +2347,8 @@
                 <wp:positionH relativeFrom="column">
                   <wp:posOffset>316230</wp:posOffset>
                 </wp:positionH>
-                <wp:positionV relativeFrom="paragraph">
-                  <wp:posOffset>4445</wp:posOffset>
+                <wp:positionV relativeFrom="page">
+                  <wp:posOffset>3810000</wp:posOffset>
                 </wp:positionV>
                 <wp:extent cx="1882775" cy="283845"/>
                 <wp:effectExtent l="19050" t="4445" r="3175" b="16510"/>
@@ -2779,12 +2642,6 @@
           </mc:Fallback>
         </mc:AlternateContent>
       </w:r>
-    </w:p>
-    <w:p>
-      <w:pPr>
-        <w:adjustRightInd w:val="0"/>
-        <w:snapToGrid w:val="0"/>
-      </w:pPr>
       <w:r>
         <mc:AlternateContent>
           <mc:Choice Requires="wps">
@@ -2794,8 +2651,8 @@
                 <wp:positionH relativeFrom="column">
                   <wp:posOffset>-56515</wp:posOffset>
                 </wp:positionH>
-                <wp:positionV relativeFrom="paragraph">
-                  <wp:posOffset>142240</wp:posOffset>
+                <wp:positionV relativeFrom="page">
+                  <wp:posOffset>4165600</wp:posOffset>
                 </wp:positionV>
                 <wp:extent cx="2097405" cy="1045845"/>
                 <wp:effectExtent l="0" t="0" r="0" b="0"/>
@@ -2830,7 +2687,7 @@
                               </w:numPr>
                               <w:adjustRightInd w:val="0"/>
                               <w:snapToGrid w:val="0"/>
-                              <w:spacing w:before="0" w:beforeAutospacing="0" w:after="0" w:afterAutospacing="0" w:line="276" w:lineRule="auto"/>
+                              <w:spacing w:before="0" w:beforeAutospacing="0" w:after="0" w:afterAutospacing="0" w:line="280" w:lineRule="exact"/>
                               <w:rPr>
                                 <w:rFonts w:ascii="微软雅黑" w:hAnsi="微软雅黑" w:eastAsia="微软雅黑"/>
                                 <w:color w:val="262626"/>
@@ -2859,7 +2716,7 @@
                               </w:numPr>
                               <w:adjustRightInd w:val="0"/>
                               <w:snapToGrid w:val="0"/>
-                              <w:spacing w:before="0" w:beforeAutospacing="0" w:after="0" w:afterAutospacing="0" w:line="276" w:lineRule="auto"/>
+                              <w:spacing w:before="0" w:beforeAutospacing="0" w:after="0" w:afterAutospacing="0" w:line="280" w:lineRule="exact"/>
                               <w:rPr>
                                 <w:rFonts w:ascii="微软雅黑" w:hAnsi="微软雅黑" w:eastAsia="微软雅黑"/>
                                 <w:color w:val="262626"/>
@@ -2888,7 +2745,7 @@
                               </w:numPr>
                               <w:adjustRightInd w:val="0"/>
                               <w:snapToGrid w:val="0"/>
-                              <w:spacing w:before="0" w:beforeAutospacing="0" w:after="0" w:afterAutospacing="0" w:line="276" w:lineRule="auto"/>
+                              <w:spacing w:before="0" w:beforeAutospacing="0" w:after="0" w:afterAutospacing="0" w:line="280" w:lineRule="exact"/>
                               <w:rPr>
                                 <w:rFonts w:ascii="微软雅黑" w:hAnsi="微软雅黑" w:eastAsia="微软雅黑"/>
                                 <w:color w:val="262626"/>
@@ -2917,7 +2774,7 @@
                               </w:numPr>
                               <w:adjustRightInd w:val="0"/>
                               <w:snapToGrid w:val="0"/>
-                              <w:spacing w:before="0" w:beforeAutospacing="0" w:after="0" w:afterAutospacing="0" w:line="276" w:lineRule="auto"/>
+                              <w:spacing w:before="0" w:beforeAutospacing="0" w:after="0" w:afterAutospacing="0" w:line="280" w:lineRule="exact"/>
                               <w:rPr>
                                 <w:rFonts w:ascii="微软雅黑" w:hAnsi="微软雅黑" w:eastAsia="微软雅黑"/>
                                 <w:color w:val="262626"/>
@@ -2948,7 +2805,7 @@
           </mc:Choice>
           <mc:Fallback>
             <w:pict>
-              <v:shape id="文本框 69" o:spid="_x0000_s1026" o:spt="202" type="#_x0000_t202" style="position:absolute;left:0pt;margin-left:-4.45pt;margin-top:11.2pt;height:82.35pt;width:165.15pt;z-index:251674624;mso-width-relative:page;mso-height-relative:page;" filled="f" stroked="f" coordsize="21600,21600" o:gfxdata="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">
+              <v:shape id="文本框 69" o:spid="_x0000_s1026" o:spt="202" type="#_x0000_t202" style="position:absolute;left:0pt;margin-left:-4.45pt;margin-top:328pt;height:82.35pt;width:165.15pt;z-index:251674624;mso-width-relative:page;mso-height-relative:page;" filled="f" stroked="f" coordsize="21600,21600" o:gfxdata="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">
                 <v:fill on="f" focussize="0,0"/>
                 <v:stroke on="f"/>
                 <v:imagedata o:title=""/>
@@ -2964,7 +2821,7 @@
                         </w:numPr>
                         <w:adjustRightInd w:val="0"/>
                         <w:snapToGrid w:val="0"/>
-                        <w:spacing w:before="0" w:beforeAutospacing="0" w:after="0" w:afterAutospacing="0" w:line="276" w:lineRule="auto"/>
+                        <w:spacing w:before="0" w:beforeAutospacing="0" w:after="0" w:afterAutospacing="0" w:line="280" w:lineRule="exact"/>
                         <w:rPr>
                           <w:rFonts w:ascii="微软雅黑" w:hAnsi="微软雅黑" w:eastAsia="微软雅黑"/>
                           <w:color w:val="262626"/>
@@ -2993,7 +2850,7 @@
                         </w:numPr>
                         <w:adjustRightInd w:val="0"/>
                         <w:snapToGrid w:val="0"/>
-                        <w:spacing w:before="0" w:beforeAutospacing="0" w:after="0" w:afterAutospacing="0" w:line="276" w:lineRule="auto"/>
+                        <w:spacing w:before="0" w:beforeAutospacing="0" w:after="0" w:afterAutospacing="0" w:line="280" w:lineRule="exact"/>
                         <w:rPr>
                           <w:rFonts w:ascii="微软雅黑" w:hAnsi="微软雅黑" w:eastAsia="微软雅黑"/>
                           <w:color w:val="262626"/>
@@ -3022,7 +2879,7 @@
                         </w:numPr>
                         <w:adjustRightInd w:val="0"/>
                         <w:snapToGrid w:val="0"/>
-                        <w:spacing w:before="0" w:beforeAutospacing="0" w:after="0" w:afterAutospacing="0" w:line="276" w:lineRule="auto"/>
+                        <w:spacing w:before="0" w:beforeAutospacing="0" w:after="0" w:afterAutospacing="0" w:line="280" w:lineRule="exact"/>
                         <w:rPr>
                           <w:rFonts w:ascii="微软雅黑" w:hAnsi="微软雅黑" w:eastAsia="微软雅黑"/>
                           <w:color w:val="262626"/>
@@ -3051,7 +2908,7 @@
                         </w:numPr>
                         <w:adjustRightInd w:val="0"/>
                         <w:snapToGrid w:val="0"/>
-                        <w:spacing w:before="0" w:beforeAutospacing="0" w:after="0" w:afterAutospacing="0" w:line="276" w:lineRule="auto"/>
+                        <w:spacing w:before="0" w:beforeAutospacing="0" w:after="0" w:afterAutospacing="0" w:line="280" w:lineRule="exact"/>
                         <w:rPr>
                           <w:rFonts w:ascii="微软雅黑" w:hAnsi="微软雅黑" w:eastAsia="微软雅黑"/>
                           <w:color w:val="262626"/>
@@ -3078,72 +2935,6 @@
           </mc:Fallback>
         </mc:AlternateContent>
       </w:r>
-    </w:p>
-    <w:p>
-      <w:pPr>
-        <w:adjustRightInd w:val="0"/>
-        <w:snapToGrid w:val="0"/>
-      </w:pPr>
-    </w:p>
-    <w:p>
-      <w:pPr>
-        <w:adjustRightInd w:val="0"/>
-        <w:snapToGrid w:val="0"/>
-      </w:pPr>
-    </w:p>
-    <w:p>
-      <w:pPr>
-        <w:adjustRightInd w:val="0"/>
-        <w:snapToGrid w:val="0"/>
-      </w:pPr>
-    </w:p>
-    <w:p>
-      <w:pPr>
-        <w:adjustRightInd w:val="0"/>
-        <w:snapToGrid w:val="0"/>
-      </w:pPr>
-    </w:p>
-    <w:p>
-      <w:pPr>
-        <w:adjustRightInd w:val="0"/>
-        <w:snapToGrid w:val="0"/>
-      </w:pPr>
-    </w:p>
-    <w:p>
-      <w:pPr>
-        <w:adjustRightInd w:val="0"/>
-        <w:snapToGrid w:val="0"/>
-      </w:pPr>
-    </w:p>
-    <w:p>
-      <w:pPr>
-        <w:adjustRightInd w:val="0"/>
-        <w:snapToGrid w:val="0"/>
-      </w:pPr>
-    </w:p>
-    <w:p>
-      <w:pPr>
-        <w:adjustRightInd w:val="0"/>
-        <w:snapToGrid w:val="0"/>
-      </w:pPr>
-    </w:p>
-    <w:p>
-      <w:pPr>
-        <w:adjustRightInd w:val="0"/>
-        <w:snapToGrid w:val="0"/>
-      </w:pPr>
-    </w:p>
-    <w:p>
-      <w:pPr>
-        <w:adjustRightInd w:val="0"/>
-        <w:snapToGrid w:val="0"/>
-      </w:pPr>
-    </w:p>
-    <w:p>
-      <w:pPr>
-        <w:adjustRightInd w:val="0"/>
-        <w:snapToGrid w:val="0"/>
-      </w:pPr>
       <w:r>
         <mc:AlternateContent>
           <mc:Choice Requires="wpg">
@@ -3153,8 +2944,8 @@
                 <wp:positionH relativeFrom="column">
                   <wp:posOffset>348615</wp:posOffset>
                 </wp:positionH>
-                <wp:positionV relativeFrom="paragraph">
-                  <wp:posOffset>33655</wp:posOffset>
+                <wp:positionV relativeFrom="page">
+                  <wp:posOffset>5461000</wp:posOffset>
                 </wp:positionV>
                 <wp:extent cx="1882775" cy="283845"/>
                 <wp:effectExtent l="19050" t="4445" r="3175" b="16510"/>
@@ -3448,18 +3239,6 @@
           </mc:Fallback>
         </mc:AlternateContent>
       </w:r>
-    </w:p>
-    <w:p>
-      <w:pPr>
-        <w:adjustRightInd w:val="0"/>
-        <w:snapToGrid w:val="0"/>
-      </w:pPr>
-    </w:p>
-    <w:p>
-      <w:pPr>
-        <w:adjustRightInd w:val="0"/>
-        <w:snapToGrid w:val="0"/>
-      </w:pPr>
       <w:r>
         <mc:AlternateContent>
           <mc:Choice Requires="wps">
@@ -3469,8 +3248,8 @@
                 <wp:positionH relativeFrom="column">
                   <wp:posOffset>-79375</wp:posOffset>
                 </wp:positionH>
-                <wp:positionV relativeFrom="paragraph">
-                  <wp:posOffset>45085</wp:posOffset>
+                <wp:positionV relativeFrom="page">
+                  <wp:posOffset>5816600</wp:posOffset>
                 </wp:positionV>
                 <wp:extent cx="2097405" cy="697865"/>
                 <wp:effectExtent l="0" t="0" r="0" b="0"/>
@@ -3565,7 +3344,7 @@
           </mc:Choice>
           <mc:Fallback>
             <w:pict>
-              <v:shape id="文本框 69" o:spid="_x0000_s1026" o:spt="202" type="#_x0000_t202" style="position:absolute;left:0pt;margin-left:-6.25pt;margin-top:3.55pt;height:54.95pt;width:165.15pt;z-index:251661312;mso-width-relative:page;mso-height-relative:page;" filled="f" stroked="f" coordsize="21600,21600" o:gfxdata="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">
+              <v:shape id="文本框 69" o:spid="_x0000_s1026" o:spt="202" type="#_x0000_t202" style="position:absolute;left:0pt;margin-left:-6.25pt;margin-top:458pt;height:54.95pt;width:165.15pt;z-index:251661312;mso-width-relative:page;mso-height-relative:page;" filled="f" stroked="f" coordsize="21600,21600" o:gfxdata="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">
                 <v:fill on="f" focussize="0,0"/>
                 <v:stroke on="f"/>
                 <v:imagedata o:title=""/>
@@ -3637,54 +3416,6 @@
           </mc:Fallback>
         </mc:AlternateContent>
       </w:r>
-    </w:p>
-    <w:p>
-      <w:pPr>
-        <w:adjustRightInd w:val="0"/>
-        <w:snapToGrid w:val="0"/>
-      </w:pPr>
-    </w:p>
-    <w:p>
-      <w:pPr>
-        <w:adjustRightInd w:val="0"/>
-        <w:snapToGrid w:val="0"/>
-      </w:pPr>
-    </w:p>
-    <w:p>
-      <w:pPr>
-        <w:adjustRightInd w:val="0"/>
-        <w:snapToGrid w:val="0"/>
-      </w:pPr>
-    </w:p>
-    <w:p>
-      <w:pPr>
-        <w:adjustRightInd w:val="0"/>
-        <w:snapToGrid w:val="0"/>
-      </w:pPr>
-    </w:p>
-    <w:p>
-      <w:pPr>
-        <w:adjustRightInd w:val="0"/>
-        <w:snapToGrid w:val="0"/>
-      </w:pPr>
-    </w:p>
-    <w:p>
-      <w:pPr>
-        <w:adjustRightInd w:val="0"/>
-        <w:snapToGrid w:val="0"/>
-      </w:pPr>
-    </w:p>
-    <w:p>
-      <w:pPr>
-        <w:adjustRightInd w:val="0"/>
-        <w:snapToGrid w:val="0"/>
-      </w:pPr>
-    </w:p>
-    <w:p>
-      <w:pPr>
-        <w:adjustRightInd w:val="0"/>
-        <w:snapToGrid w:val="0"/>
-      </w:pPr>
       <w:r>
         <mc:AlternateContent>
           <mc:Choice Requires="wpg">
@@ -3694,8 +3425,8 @@
                 <wp:positionH relativeFrom="column">
                   <wp:posOffset>359410</wp:posOffset>
                 </wp:positionH>
-                <wp:positionV relativeFrom="paragraph">
-                  <wp:posOffset>123825</wp:posOffset>
+                <wp:positionV relativeFrom="page">
+                  <wp:posOffset>6794500</wp:posOffset>
                 </wp:positionV>
                 <wp:extent cx="1882775" cy="283845"/>
                 <wp:effectExtent l="19050" t="4445" r="3175" b="16510"/>
@@ -3998,8 +3729,8 @@
                 <wp:positionH relativeFrom="column">
                   <wp:posOffset>2661285</wp:posOffset>
                 </wp:positionH>
-                <wp:positionV relativeFrom="paragraph">
-                  <wp:posOffset>95885</wp:posOffset>
+                <wp:positionV relativeFrom="page">
+                  <wp:posOffset>7620000</wp:posOffset>
                 </wp:positionV>
                 <wp:extent cx="4453255" cy="283845"/>
                 <wp:effectExtent l="19050" t="4445" r="4445" b="16510"/>
@@ -4293,18 +4024,6 @@
           </mc:Fallback>
         </mc:AlternateContent>
       </w:r>
-    </w:p>
-    <w:p>
-      <w:pPr>
-        <w:adjustRightInd w:val="0"/>
-        <w:snapToGrid w:val="0"/>
-      </w:pPr>
-    </w:p>
-    <w:p>
-      <w:pPr>
-        <w:adjustRightInd w:val="0"/>
-        <w:snapToGrid w:val="0"/>
-      </w:pPr>
       <w:r>
         <mc:AlternateContent>
           <mc:Choice Requires="wps">
@@ -4314,8 +4033,8 @@
                 <wp:positionH relativeFrom="column">
                   <wp:posOffset>2482850</wp:posOffset>
                 </wp:positionH>
-                <wp:positionV relativeFrom="paragraph">
-                  <wp:posOffset>73025</wp:posOffset>
+                <wp:positionV relativeFrom="page">
+                  <wp:posOffset>8001000</wp:posOffset>
                 </wp:positionV>
                 <wp:extent cx="4898390" cy="1101090"/>
                 <wp:effectExtent l="0" t="0" r="0" b="0"/>
@@ -4350,7 +4069,7 @@
                               </w:numPr>
                               <w:adjustRightInd w:val="0"/>
                               <w:snapToGrid w:val="0"/>
-                              <w:spacing w:before="0" w:beforeAutospacing="0" w:after="0" w:afterAutospacing="0" w:line="360" w:lineRule="auto"/>
+                              <w:spacing w:before="0" w:beforeAutospacing="0" w:after="0" w:afterAutospacing="0" w:line="280" w:lineRule="exact"/>
                               <w:rPr>
                                 <w:rFonts w:ascii="微软雅黑" w:hAnsi="微软雅黑" w:eastAsia="微软雅黑"/>
                                 <w:bCs/>
@@ -4377,7 +4096,7 @@
                               </w:numPr>
                               <w:adjustRightInd w:val="0"/>
                               <w:snapToGrid w:val="0"/>
-                              <w:spacing w:before="0" w:beforeAutospacing="0" w:after="0" w:afterAutospacing="0" w:line="360" w:lineRule="auto"/>
+                              <w:spacing w:before="0" w:beforeAutospacing="0" w:after="0" w:afterAutospacing="0" w:line="280" w:lineRule="exact"/>
                               <w:rPr>
                                 <w:rFonts w:ascii="微软雅黑" w:hAnsi="微软雅黑" w:eastAsia="微软雅黑"/>
                                 <w:bCs/>
@@ -4404,7 +4123,7 @@
                               </w:numPr>
                               <w:adjustRightInd w:val="0"/>
                               <w:snapToGrid w:val="0"/>
-                              <w:spacing w:before="0" w:beforeAutospacing="0" w:after="0" w:afterAutospacing="0" w:line="360" w:lineRule="auto"/>
+                              <w:spacing w:before="0" w:beforeAutospacing="0" w:after="0" w:afterAutospacing="0" w:line="280" w:lineRule="exact"/>
                               <w:rPr>
                                 <w:rFonts w:ascii="微软雅黑" w:hAnsi="微软雅黑" w:eastAsia="微软雅黑"/>
                                 <w:bCs/>
@@ -4433,7 +4152,7 @@
           </mc:Choice>
           <mc:Fallback>
             <w:pict>
-              <v:shape id="文本框 88" o:spid="_x0000_s1026" o:spt="202" type="#_x0000_t202" style="position:absolute;left:0pt;margin-left:195.5pt;margin-top:5.75pt;height:86.7pt;width:385.7pt;z-index:251665408;mso-width-relative:page;mso-height-relative:page;" filled="f" stroked="f" coordsize="21600,21600" o:gfxdata="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">
+              <v:shape id="文本框 88" o:spid="_x0000_s1026" o:spt="202" type="#_x0000_t202" style="position:absolute;left:0pt;margin-left:195.5pt;margin-top:630pt;height:86.7pt;width:385.7pt;z-index:251665408;mso-width-relative:page;mso-height-relative:page;" filled="f" stroked="f" coordsize="21600,21600" o:gfxdata="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">
                 <v:fill on="f" focussize="0,0"/>
                 <v:stroke on="f"/>
                 <v:imagedata o:title=""/>
@@ -4449,7 +4168,7 @@
                         </w:numPr>
                         <w:adjustRightInd w:val="0"/>
                         <w:snapToGrid w:val="0"/>
-                        <w:spacing w:before="0" w:beforeAutospacing="0" w:after="0" w:afterAutospacing="0" w:line="360" w:lineRule="auto"/>
+                        <w:spacing w:before="0" w:beforeAutospacing="0" w:after="0" w:afterAutospacing="0" w:line="280" w:lineRule="exact"/>
                         <w:rPr>
                           <w:rFonts w:ascii="微软雅黑" w:hAnsi="微软雅黑" w:eastAsia="微软雅黑"/>
                           <w:bCs/>
@@ -4476,7 +4195,7 @@
                         </w:numPr>
                         <w:adjustRightInd w:val="0"/>
                         <w:snapToGrid w:val="0"/>
-                        <w:spacing w:before="0" w:beforeAutospacing="0" w:after="0" w:afterAutospacing="0" w:line="360" w:lineRule="auto"/>
+                        <w:spacing w:before="0" w:beforeAutospacing="0" w:after="0" w:afterAutospacing="0" w:line="280" w:lineRule="exact"/>
                         <w:rPr>
                           <w:rFonts w:ascii="微软雅黑" w:hAnsi="微软雅黑" w:eastAsia="微软雅黑"/>
                           <w:bCs/>
@@ -4503,7 +4222,7 @@
                         </w:numPr>
                         <w:adjustRightInd w:val="0"/>
                         <w:snapToGrid w:val="0"/>
-                        <w:spacing w:before="0" w:beforeAutospacing="0" w:after="0" w:afterAutospacing="0" w:line="360" w:lineRule="auto"/>
+                        <w:spacing w:before="0" w:beforeAutospacing="0" w:after="0" w:afterAutospacing="0" w:line="280" w:lineRule="exact"/>
                         <w:rPr>
                           <w:rFonts w:ascii="微软雅黑" w:hAnsi="微软雅黑" w:eastAsia="微软雅黑"/>
                           <w:bCs/>
@@ -4528,12 +4247,6 @@
           </mc:Fallback>
         </mc:AlternateContent>
       </w:r>
-    </w:p>
-    <w:p>
-      <w:pPr>
-        <w:adjustRightInd w:val="0"/>
-        <w:snapToGrid w:val="0"/>
-      </w:pPr>
       <w:r>
         <mc:AlternateContent>
           <mc:Choice Requires="wps">
@@ -4543,8 +4256,8 @@
                 <wp:positionH relativeFrom="column">
                   <wp:posOffset>208915</wp:posOffset>
                 </wp:positionH>
-                <wp:positionV relativeFrom="paragraph">
-                  <wp:posOffset>113665</wp:posOffset>
+                <wp:positionV relativeFrom="page">
+                  <wp:posOffset>7175500</wp:posOffset>
                 </wp:positionV>
                 <wp:extent cx="1877060" cy="2421255"/>
                 <wp:effectExtent l="0" t="0" r="0" b="0"/>
@@ -4579,7 +4292,7 @@
                               </w:numPr>
                               <w:adjustRightInd w:val="0"/>
                               <w:snapToGrid w:val="0"/>
-                              <w:spacing w:line="276" w:lineRule="auto"/>
+                              <w:spacing w:line="280" w:lineRule="exact" w:before="0" w:after="0"/>
                               <w:rPr>
                                 <w:rFonts w:ascii="微软雅黑" w:hAnsi="微软雅黑" w:eastAsia="微软雅黑"/>
                                 <w:color w:val="262626"/>
@@ -4608,7 +4321,7 @@
                               </w:numPr>
                               <w:adjustRightInd w:val="0"/>
                               <w:snapToGrid w:val="0"/>
-                              <w:spacing w:line="276" w:lineRule="auto"/>
+                              <w:spacing w:line="280" w:lineRule="exact" w:before="0" w:after="0"/>
                               <w:rPr>
                                 <w:rFonts w:ascii="微软雅黑" w:hAnsi="微软雅黑" w:eastAsia="微软雅黑"/>
                                 <w:color w:val="262626"/>
@@ -4637,7 +4350,7 @@
                               </w:numPr>
                               <w:adjustRightInd w:val="0"/>
                               <w:snapToGrid w:val="0"/>
-                              <w:spacing w:line="276" w:lineRule="auto"/>
+                              <w:spacing w:line="280" w:lineRule="exact" w:before="0" w:after="0"/>
                               <w:rPr>
                                 <w:rFonts w:ascii="微软雅黑" w:hAnsi="微软雅黑" w:eastAsia="微软雅黑"/>
                                 <w:color w:val="262626"/>
@@ -4668,7 +4381,7 @@
           </mc:Choice>
           <mc:Fallback>
             <w:pict>
-              <v:shape id="文本框 69" o:spid="_x0000_s1026" o:spt="202" type="#_x0000_t202" style="position:absolute;left:0pt;margin-left:16.45pt;margin-top:8.95pt;height:190.65pt;width:147.8pt;z-index:251666432;mso-width-relative:page;mso-height-relative:page;" filled="f" stroked="f" coordsize="21600,21600" o:gfxdata="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">
+              <v:shape id="文本框 69" o:spid="_x0000_s1026" o:spt="202" type="#_x0000_t202" style="position:absolute;left:0pt;margin-left:16.45pt;margin-top:565pt;height:190.65pt;width:147.8pt;z-index:251666432;mso-width-relative:page;mso-height-relative:page;" filled="f" stroked="f" coordsize="21600,21600" o:gfxdata="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">
                 <v:fill on="f" focussize="0,0"/>
                 <v:stroke on="f"/>
                 <v:imagedata o:title=""/>
@@ -4684,7 +4397,7 @@
                         </w:numPr>
                         <w:adjustRightInd w:val="0"/>
                         <w:snapToGrid w:val="0"/>
-                        <w:spacing w:line="276" w:lineRule="auto"/>
+                        <w:spacing w:line="280" w:lineRule="exact" w:before="0" w:after="0"/>
                         <w:rPr>
                           <w:rFonts w:ascii="微软雅黑" w:hAnsi="微软雅黑" w:eastAsia="微软雅黑"/>
                           <w:color w:val="262626"/>
@@ -4713,7 +4426,7 @@
                         </w:numPr>
                         <w:adjustRightInd w:val="0"/>
                         <w:snapToGrid w:val="0"/>
-                        <w:spacing w:line="276" w:lineRule="auto"/>
+                        <w:spacing w:line="280" w:lineRule="exact" w:before="0" w:after="0"/>
                         <w:rPr>
                           <w:rFonts w:ascii="微软雅黑" w:hAnsi="微软雅黑" w:eastAsia="微软雅黑"/>
                           <w:color w:val="262626"/>
@@ -4742,7 +4455,7 @@
                         </w:numPr>
                         <w:adjustRightInd w:val="0"/>
                         <w:snapToGrid w:val="0"/>
-                        <w:spacing w:line="276" w:lineRule="auto"/>
+                        <w:spacing w:line="280" w:lineRule="exact" w:before="0" w:after="0"/>
                         <w:rPr>
                           <w:rFonts w:ascii="微软雅黑" w:hAnsi="微软雅黑" w:eastAsia="微软雅黑"/>
                           <w:color w:val="262626"/>
@@ -4769,60 +4482,9 @@
           </mc:Fallback>
         </mc:AlternateContent>
       </w:r>
-    </w:p>
-    <w:p>
-      <w:pPr>
-        <w:adjustRightInd w:val="0"/>
-        <w:snapToGrid w:val="0"/>
-      </w:pPr>
-    </w:p>
-    <w:p>
-      <w:pPr>
-        <w:adjustRightInd w:val="0"/>
-        <w:snapToGrid w:val="0"/>
-      </w:pPr>
-    </w:p>
-    <w:p>
-      <w:pPr>
-        <w:adjustRightInd w:val="0"/>
-        <w:snapToGrid w:val="0"/>
-      </w:pPr>
-    </w:p>
-    <w:p>
-      <w:pPr>
-        <w:adjustRightInd w:val="0"/>
-        <w:snapToGrid w:val="0"/>
-      </w:pPr>
-    </w:p>
-    <w:p>
-      <w:pPr>
-        <w:tabs>
-          <w:tab w:val="left" w:pos="3968"/>
-        </w:tabs>
-        <w:adjustRightInd w:val="0"/>
-        <w:snapToGrid w:val="0"/>
-      </w:pPr>
       <w:r>
         <w:tab/>
       </w:r>
-    </w:p>
-    <w:p>
-      <w:pPr>
-        <w:adjustRightInd w:val="0"/>
-        <w:snapToGrid w:val="0"/>
-      </w:pPr>
-    </w:p>
-    <w:p>
-      <w:pPr>
-        <w:adjustRightInd w:val="0"/>
-        <w:snapToGrid w:val="0"/>
-      </w:pPr>
-    </w:p>
-    <w:p>
-      <w:pPr>
-        <w:adjustRightInd w:val="0"/>
-        <w:snapToGrid w:val="0"/>
-      </w:pPr>
       <w:r>
         <mc:AlternateContent>
           <mc:Choice Requires="wpg">
@@ -4832,8 +4494,8 @@
                 <wp:positionH relativeFrom="column">
                   <wp:posOffset>2662555</wp:posOffset>
                 </wp:positionH>
-                <wp:positionV relativeFrom="paragraph">
-                  <wp:posOffset>19050</wp:posOffset>
+                <wp:positionV relativeFrom="page">
+                  <wp:posOffset>9080500</wp:posOffset>
                 </wp:positionV>
                 <wp:extent cx="4453255" cy="283845"/>
                 <wp:effectExtent l="19050" t="4445" r="4445" b="16510"/>
@@ -5145,14 +4807,6 @@
           </mc:Fallback>
         </mc:AlternateContent>
       </w:r>
-    </w:p>
-    <w:p>
-      <w:pPr>
-        <w:adjustRightInd w:val="0"/>
-        <w:snapToGrid w:val="0"/>
-      </w:pPr>
-    </w:p>
-    <w:p>
       <w:r>
         <mc:AlternateContent>
           <mc:Choice Requires="wps">
@@ -5162,8 +4816,8 @@
                 <wp:positionH relativeFrom="column">
                   <wp:posOffset>2719070</wp:posOffset>
                 </wp:positionH>
-                <wp:positionV relativeFrom="paragraph">
-                  <wp:posOffset>50165</wp:posOffset>
+                <wp:positionV relativeFrom="page">
+                  <wp:posOffset>9461500</wp:posOffset>
                 </wp:positionV>
                 <wp:extent cx="3967480" cy="958850"/>
                 <wp:effectExtent l="0" t="0" r="0" b="0"/>
@@ -5198,7 +4852,7 @@
                               </w:numPr>
                               <w:adjustRightInd w:val="0"/>
                               <w:snapToGrid w:val="0"/>
-                              <w:spacing w:before="0" w:beforeAutospacing="0" w:after="0" w:afterAutospacing="0" w:line="276" w:lineRule="auto"/>
+                              <w:spacing w:before="0" w:beforeAutospacing="0" w:after="0" w:afterAutospacing="0" w:line="280" w:lineRule="exact"/>
                               <w:rPr>
                                 <w:rFonts w:ascii="微软雅黑" w:hAnsi="微软雅黑" w:eastAsia="微软雅黑"/>
                                 <w:kern w:val="24"/>
@@ -5272,7 +4926,7 @@
                               </w:numPr>
                               <w:adjustRightInd w:val="0"/>
                               <w:snapToGrid w:val="0"/>
-                              <w:spacing w:before="0" w:beforeAutospacing="0" w:after="0" w:afterAutospacing="0" w:line="276" w:lineRule="auto"/>
+                              <w:spacing w:before="0" w:beforeAutospacing="0" w:after="0" w:afterAutospacing="0" w:line="280" w:lineRule="exact"/>
                               <w:rPr>
                                 <w:rFonts w:ascii="微软雅黑" w:hAnsi="微软雅黑" w:eastAsia="微软雅黑"/>
                                 <w:kern w:val="24"/>
@@ -5315,7 +4969,7 @@
                               <w:pStyle w:val="5"/>
                               <w:adjustRightInd w:val="0"/>
                               <w:snapToGrid w:val="0"/>
-                              <w:spacing w:before="0" w:beforeAutospacing="0" w:after="0" w:afterAutospacing="0" w:line="276" w:lineRule="auto"/>
+                              <w:spacing w:before="0" w:beforeAutospacing="0" w:after="0" w:afterAutospacing="0" w:line="280" w:lineRule="exact"/>
                               <w:ind w:left="945" w:leftChars="450" w:firstLine="600" w:firstLineChars="300"/>
                               <w:rPr>
                                 <w:rFonts w:ascii="微软雅黑" w:hAnsi="微软雅黑" w:eastAsia="微软雅黑"/>
@@ -5393,7 +5047,7 @@
                               <w:pStyle w:val="5"/>
                               <w:adjustRightInd w:val="0"/>
                               <w:snapToGrid w:val="0"/>
-                              <w:spacing w:before="0" w:beforeAutospacing="0" w:after="0" w:afterAutospacing="0" w:line="276" w:lineRule="auto"/>
+                              <w:spacing w:before="0" w:beforeAutospacing="0" w:after="0" w:afterAutospacing="0" w:line="280" w:lineRule="exact"/>
                               <w:rPr>
                                 <w:rFonts w:ascii="微软雅黑" w:hAnsi="微软雅黑" w:eastAsia="微软雅黑"/>
                                 <w:color w:val="262626"/>
@@ -5414,7 +5068,7 @@
           </mc:Choice>
           <mc:Fallback>
             <w:pict>
-              <v:shape id="文本框 69" o:spid="_x0000_s1026" o:spt="202" type="#_x0000_t202" style="position:absolute;left:0pt;margin-left:214.1pt;margin-top:3.95pt;height:75.5pt;width:312.4pt;z-index:251664384;mso-width-relative:page;mso-height-relative:page;" filled="f" stroked="f" coordsize="21600,21600" o:gfxdata="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">
+              <v:shape id="文本框 69" o:spid="_x0000_s1026" o:spt="202" type="#_x0000_t202" style="position:absolute;left:0pt;margin-left:214.1pt;margin-top:745pt;height:75.5pt;width:312.4pt;z-index:251664384;mso-width-relative:page;mso-height-relative:page;" filled="f" stroked="f" coordsize="21600,21600" o:gfxdata="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">
                 <v:fill on="f" focussize="0,0"/>
                 <v:stroke on="f"/>
                 <v:imagedata o:title=""/>
@@ -5430,7 +5084,7 @@
                         </w:numPr>
                         <w:adjustRightInd w:val="0"/>
                         <w:snapToGrid w:val="0"/>
-                        <w:spacing w:before="0" w:beforeAutospacing="0" w:after="0" w:afterAutospacing="0" w:line="276" w:lineRule="auto"/>
+                        <w:spacing w:before="0" w:beforeAutospacing="0" w:after="0" w:afterAutospacing="0" w:line="280" w:lineRule="exact"/>
                         <w:rPr>
                           <w:rFonts w:ascii="微软雅黑" w:hAnsi="微软雅黑" w:eastAsia="微软雅黑"/>
                           <w:kern w:val="24"/>
@@ -5504,7 +5158,7 @@
                         </w:numPr>
                         <w:adjustRightInd w:val="0"/>
                         <w:snapToGrid w:val="0"/>
-                        <w:spacing w:before="0" w:beforeAutospacing="0" w:after="0" w:afterAutospacing="0" w:line="276" w:lineRule="auto"/>
+                        <w:spacing w:before="0" w:beforeAutospacing="0" w:after="0" w:afterAutospacing="0" w:line="280" w:lineRule="exact"/>
                         <w:rPr>
                           <w:rFonts w:ascii="微软雅黑" w:hAnsi="微软雅黑" w:eastAsia="微软雅黑"/>
                           <w:kern w:val="24"/>
@@ -5547,7 +5201,7 @@
                         <w:pStyle w:val="5"/>
                         <w:adjustRightInd w:val="0"/>
                         <w:snapToGrid w:val="0"/>
-                        <w:spacing w:before="0" w:beforeAutospacing="0" w:after="0" w:afterAutospacing="0" w:line="276" w:lineRule="auto"/>
+                        <w:spacing w:before="0" w:beforeAutospacing="0" w:after="0" w:afterAutospacing="0" w:line="280" w:lineRule="exact"/>
                         <w:ind w:left="945" w:leftChars="450" w:firstLine="600" w:firstLineChars="300"/>
                         <w:rPr>
                           <w:rFonts w:ascii="微软雅黑" w:hAnsi="微软雅黑" w:eastAsia="微软雅黑"/>
@@ -5625,7 +5279,7 @@
                         <w:pStyle w:val="5"/>
                         <w:adjustRightInd w:val="0"/>
                         <w:snapToGrid w:val="0"/>
-                        <w:spacing w:before="0" w:beforeAutospacing="0" w:after="0" w:afterAutospacing="0" w:line="276" w:lineRule="auto"/>
+                        <w:spacing w:before="0" w:beforeAutospacing="0" w:after="0" w:afterAutospacing="0" w:line="280" w:lineRule="exact"/>
                         <w:rPr>
                           <w:rFonts w:ascii="微软雅黑" w:hAnsi="微软雅黑" w:eastAsia="微软雅黑"/>
                           <w:color w:val="262626"/>
@@ -5643,14 +5297,6 @@
         </mc:AlternateContent>
       </w:r>
     </w:p>
-    <w:p/>
-    <w:p/>
-    <w:p/>
-    <w:p/>
-    <w:p/>
-    <w:p/>
-    <w:p/>
-    <w:p/>
     <w:sectPr>
       <w:pgSz w:w="11850" w:h="16783"/>
       <w:pgMar w:top="0" w:right="0" w:bottom="0" w:left="0" w:header="851" w:footer="992" w:gutter="0"/>

</xml_diff>